<commit_message>
Cartel: estructura definitiva de 3 pasos (Ubicacion / Informacion general / Contenido)
Solo nomenclatura y agrupacion de pasos: mismos campos, misma logica y mismas validaciones.
El campo del mapa pasa a llamarse 'URL de Google Maps' y se ajusta el texto de ayuda de las fotos.
Guia de Cartel actualizada a 1.1.

Co-Authored-By: Claude Opus 5 <noreply@anthropic.com>
Claude-Session: https://claude.ai/code/session_01JkU9BrFwXYbLVUvW55gcE9
</commit_message>
<xml_diff>
--- a/docs/manuales/Guia_Cartel.docx
+++ b/docs/manuales/Guia_Cartel.docx
@@ -80,7 +80,7 @@
           <w:color w:val="56648F"/>
           <w:sz w:val="21"/>
         </w:rPr>
-        <w:t>Versión 1.0   ·   21/08/2026</w:t>
+        <w:t>Versión 1.1   ·   21/08/2026</w:t>
       </w:r>
     </w:p>
     <w:p/>
@@ -96,7 +96,7 @@
     </w:p>
     <w:p>
       <w:r>
-        <w:t>Solicitud para producir y colocar un cartel en un inmueble. Es una actividad de Actividades de Marketing &amp; Research: primero se completa el Formulario Base (tipo de actividad, prioridad, cuenta/contacto, unidad de negocio) y al elegir 'Cartel' se abre este formulario.</w:t>
+        <w:t>Solicitud para producir y colocar un cartel en un inmueble. Es una actividad de Actividades de Marketing &amp; Research: primero se completa el Formulario Base (tipo de actividad, prioridad, cuenta/contacto, unidad de negocio) y al elegir 'Cartel' se abre este formulario, que se completa en tres pasos: 1) Ubicación, 2) Información general y 3) Contenido.</w:t>
       </w:r>
     </w:p>
     <w:p/>
@@ -183,7 +183,7 @@
           <w:color w:val="00285A"/>
           <w:sz w:val="23"/>
         </w:rPr>
-        <w:t>Link de Google Maps</w:t>
+        <w:t>URL de Google Maps</w:t>
       </w:r>
     </w:p>
     <w:p>
@@ -198,7 +198,7 @@
     </w:p>
     <w:p>
       <w:r>
-        <w:t>Se genera solo a partir del inmueble y se muestra como 'Ver ubicación en Google Maps', que abre el mapa en una pestaña nueva. Si el inmueble no tiene dirección suficiente, se avisa y no se genera un enlace incorrecto.</w:t>
+        <w:t>Se genera sola a partir del inmueble y se muestra como 'Ver ubicación en Google Maps', que abre el mapa en una pestaña nueva. Si el inmueble no tiene dirección suficiente, se avisa y no se genera un enlace incorrecto.</w:t>
       </w:r>
     </w:p>
     <w:p>

</xml_diff>

<commit_message>
Cartel: las dimensiones se expresan en centimetros
Ancho y Alto pasan de m a cm (etiquetas y ejemplos). Misma logica y validaciones.
Guia de Cartel actualizada a 1.2.

Co-Authored-By: Claude Opus 5 <noreply@anthropic.com>
Claude-Session: https://claude.ai/code/session_01JkU9BrFwXYbLVUvW55gcE9
</commit_message>
<xml_diff>
--- a/docs/manuales/Guia_Cartel.docx
+++ b/docs/manuales/Guia_Cartel.docx
@@ -80,7 +80,7 @@
           <w:color w:val="56648F"/>
           <w:sz w:val="21"/>
         </w:rPr>
-        <w:t>Versión 1.1   ·   21/08/2026</w:t>
+        <w:t>Versión 1.2   ·   08/09/2026</w:t>
       </w:r>
     </w:p>
     <w:p/>
@@ -231,7 +231,7 @@
     </w:p>
     <w:p>
       <w:r>
-        <w:t>Qué ingresar: el tamaño del cartel en metros. Los dos son obligatorios y tienen que ser mayores a cero.</w:t>
+        <w:t>Qué ingresar: el tamaño del cartel en centímetros. Los dos son obligatorios y tienen que ser mayores a cero.</w:t>
       </w:r>
     </w:p>
     <w:p>

</xml_diff>

<commit_message>
Cartel: adjuntar el estilo del cartel en el paso Contenido
- Nuevo campo opcional 'Estilo del cartel' para adjuntar un modelo o referencia ya existente
- Reutiliza la misma galeria de archivos (carga multiple, miniaturas, borrado antes de guardar) y
  ademas admite PDF; lo que no es imagen se muestra como archivo en vez de una miniatura rota
- No afecta las validaciones: las dos secciones de fotos siguen siendo obligatorias
- Guia de Cartel actualizada a 1.3

Co-Authored-By: Claude Opus 5 <noreply@anthropic.com>
Claude-Session: https://claude.ai/code/session_01JkU9BrFwXYbLVUvW55gcE9
</commit_message>
<xml_diff>
--- a/docs/manuales/Guia_Cartel.docx
+++ b/docs/manuales/Guia_Cartel.docx
@@ -80,7 +80,7 @@
           <w:color w:val="56648F"/>
           <w:sz w:val="21"/>
         </w:rPr>
-        <w:t>Versión 1.2   ·   08/09/2026</w:t>
+        <w:t>Versión 1.3   ·   08/09/2026</w:t>
       </w:r>
     </w:p>
     <w:p/>
@@ -364,6 +364,39 @@
     <w:p>
       <w:r>
         <w:t>Qué ingresar: al menos una foto. El lugar exacto y la superficie donde se va a colocar el cartel. También admite varias fotos.</w:t>
+      </w:r>
+    </w:p>
+    <w:p>
+      <w:r>
+        <w:rPr>
+          <w:color w:val="C9D6F0"/>
+        </w:rPr>
+        <w:t>──────────────────────────────────────────────</w:t>
+      </w:r>
+    </w:p>
+    <w:p>
+      <w:r>
+        <w:rPr>
+          <w:b/>
+          <w:color w:val="00285A"/>
+          <w:sz w:val="23"/>
+        </w:rPr>
+        <w:t>Estilo del cartel</w:t>
+      </w:r>
+    </w:p>
+    <w:p>
+      <w:r>
+        <w:rPr>
+          <w:b/>
+          <w:color w:val="1C54F4"/>
+          <w:sz w:val="21"/>
+        </w:rPr>
+        <w:t>Qué ingresar:</w:t>
+      </w:r>
+    </w:p>
+    <w:p>
+      <w:r>
+        <w:t>Qué ingresar: opcional. Si ya tenés un modelo del cartel o una referencia de cómo lo querés, adjuntalo acá. Admite varias imágenes y también PDF; se pueden quitar antes de guardar.</w:t>
       </w:r>
     </w:p>
     <w:p/>

</xml_diff>